<commit_message>
Updated the TEST_0 stego-files attacked by the 4th active attack as well
</commit_message>
<xml_diff>
--- a/data_set/TEST_0/attacked_stego_files/stego_method_4_04_format_attack_TEST_0.docx
+++ b/data_set/TEST_0/attacked_stego_files/stego_method_4_04_format_attack_TEST_0.docx
@@ -8,6 +8,11 @@
         <w:jc w:val="both"/>
       </w:pPr>
       <w:r>
+        <w:rPr>
+          <w:rFonts w:ascii="Britannic Bold" w:hAnsi="Britannic Bold"/>
+          <w:color w:val="232323"/>
+          <w:sz w:val="32"/>
+        </w:rPr>
         <w:t>Intelligence in War</w:t>
       </w:r>
     </w:p>
@@ -17,31 +22,41 @@
       </w:pPr>
       <w:r>
         <w:rPr>
-          <w:rStyle w:val="stego_style"/>
+          <w:rFonts w:ascii="Britannic Bold" w:hAnsi="Britannic Bold"/>
+          <w:color w:val="232323"/>
+          <w:sz w:val="32"/>
         </w:rPr>
         <w:t>By "intelligence" we mean every sort of information about the enemy and his country</w:t>
       </w:r>
       <w:r>
         <w:rPr>
-          <w:rStyle w:val="stego_style"/>
-        </w:rPr>
-        <w:t xml:space="preserve"> </w:t>
-      </w:r>
-      <w:r>
-        <w:rPr>
-          <w:rStyle w:val="stego_style"/>
+          <w:rFonts w:ascii="Britannic Bold" w:hAnsi="Britannic Bold"/>
+          <w:color w:val="232323"/>
+          <w:sz w:val="32"/>
+        </w:rPr>
+        <w:t xml:space="preserve"> </w:t>
+      </w:r>
+      <w:r>
+        <w:rPr>
+          <w:rFonts w:ascii="Britannic Bold" w:hAnsi="Britannic Bold"/>
+          <w:color w:val="232323"/>
+          <w:sz w:val="32"/>
         </w:rPr>
         <w:t>-</w:t>
       </w:r>
       <w:r>
         <w:rPr>
-          <w:rStyle w:val="stego_style"/>
-        </w:rPr>
-        <w:t xml:space="preserve"> </w:t>
-      </w:r>
-      <w:r>
-        <w:rPr>
-          <w:rStyle w:val="stego_style"/>
+          <w:rFonts w:ascii="Britannic Bold" w:hAnsi="Britannic Bold"/>
+          <w:color w:val="232323"/>
+          <w:sz w:val="32"/>
+        </w:rPr>
+        <w:t xml:space="preserve"> </w:t>
+      </w:r>
+      <w:r>
+        <w:rPr>
+          <w:rFonts w:ascii="Britannic Bold" w:hAnsi="Britannic Bold"/>
+          <w:color w:val="232323"/>
+          <w:sz w:val="32"/>
         </w:rPr>
         <w:t>the basis, in short of our own plans and operations. If we consider the actual basis of this information, how unreliable and transient it is, we soon realize that war is a flimsy structure that can easily collapse and bury us in its ruins. The textbooks agree, of course, that we should only believe reliable intelligence, and should never cease to be suspicious, but what is the use of such feeble maxims? They belong to that wisdom which for want of anything better scribblers of systems and compendia resort to when they run out of ideas.</w:t>
       </w:r>
@@ -52,7 +67,9 @@
       </w:pPr>
       <w:r>
         <w:rPr>
-          <w:rStyle w:val="stego_style"/>
+          <w:rFonts w:ascii="Britannic Bold" w:hAnsi="Britannic Bold"/>
+          <w:color w:val="232323"/>
+          <w:sz w:val="32"/>
         </w:rPr>
         <w:t>Many intelligence reports in war are contradictory; even more are false, and most are uncertain. What one can reasonably ask of an officer is that he should possess a standard of judgment, which he can gain only from knowledge of men and affairs and from common sense. He should be guided by the laws of probability. These are difficult enough to apply when plans are drafted in an office, far from the sphere of action; the task becomes infinitely harder in the thick of fighting itself, with reports streaming in. At such times one is lucky if their contradictions cancel each other out and leave a kind of balance to be critically assessed. It is much worse for the novice if chance does not help him in that way, and on the contrary one report tallies with another, confirms it, magnifies it, lends it colour, till he has to make a quick decision-which is soon recognized to be mistaken, just as the reports turn out to be lies, exaggerations, errors, and so on. In short, most intelligence is false, and the effect of fear is to multiply lies and inaccuracies. As a rule, most men would rather believe bad news than good and rather tend to exaggerate the bad news. The dangers that are reported may soon, like waves, subside; but like waves they keep recurring, without apparent reason. The commander must trust his judgment and stand like a rock on which the waves break in vain. It is not an easy thing to do. If he does not have a buoyant disposition, if experience of war has not trained him and matured his judgment, he had better make it a rule to suppress his personal convictions and give his hopes and not his fears the benefit of the doubt. Only thus can he preserve a proper balance.</w:t>
       </w:r>
@@ -63,45 +80,59 @@
       </w:pPr>
       <w:r>
         <w:rPr>
-          <w:rStyle w:val="stego_style"/>
+          <w:rFonts w:ascii="Britannic Bold" w:hAnsi="Britannic Bold"/>
+          <w:color w:val="232323"/>
+          <w:sz w:val="32"/>
         </w:rPr>
         <w:t xml:space="preserve">This difficulty of accurate recognition constitutes one of the most serious sources of friction in war, by making things appear entirely different from what one had expected. The senses make a more vivid impression on the mind than systematic thought-so much so that I doubt if a commander ever launched an operation of any magnitude without being forced to repress BOOK ONE new misgivings from the start. Ordinary men, who normally follow the initiative of others, tend to lose self-confidence when they reach the scene of action: things are not what they expected, the more so as they still let others influence them. But even the man who planned the operation and now sees it being carried out may well lose confidence in his </w:t>
       </w:r>
       <w:r>
         <w:rPr>
-          <w:rStyle w:val="stego_style"/>
+          <w:rFonts w:ascii="Britannic Bold" w:hAnsi="Britannic Bold"/>
+          <w:color w:val="232323"/>
+          <w:sz w:val="32"/>
         </w:rPr>
         <w:t>e</w:t>
       </w:r>
       <w:r>
         <w:rPr>
-          <w:rStyle w:val="stego_style"/>
+          <w:rFonts w:ascii="Britannic Bold" w:hAnsi="Britannic Bold"/>
+          <w:color w:val="232323"/>
+          <w:sz w:val="32"/>
         </w:rPr>
         <w:t xml:space="preserve">arlier </w:t>
       </w:r>
       <w:proofErr w:type="gramStart"/>
       <w:r>
         <w:rPr>
-          <w:rStyle w:val="stego_style"/>
+          <w:rFonts w:ascii="Britannic Bold" w:hAnsi="Britannic Bold"/>
+          <w:color w:val="232323"/>
+          <w:sz w:val="32"/>
         </w:rPr>
         <w:t>judgment;</w:t>
       </w:r>
       <w:proofErr w:type="gramEnd"/>
       <w:r>
         <w:rPr>
-          <w:rStyle w:val="stego_style"/>
+          <w:rFonts w:ascii="Britannic Bold" w:hAnsi="Britannic Bold"/>
+          <w:color w:val="232323"/>
+          <w:sz w:val="32"/>
         </w:rPr>
         <w:t xml:space="preserve"> whereas self-reliance is his best defence against the pressures of the moment. War has a way of masking the stage with scenery crudely daubed with fearsome apparitions. Once this is cleared away, and the horizon becomes unobstructed, developments will confirm his earlier convictions</w:t>
       </w:r>
       <w:r>
         <w:rPr>
-          <w:rStyle w:val="stego_style"/>
+          <w:rFonts w:ascii="Britannic Bold" w:hAnsi="Britannic Bold"/>
+          <w:color w:val="232323"/>
+          <w:sz w:val="32"/>
         </w:rPr>
         <w:t xml:space="preserve"> - </w:t>
       </w:r>
       <w:r>
         <w:rPr>
-          <w:rStyle w:val="stego_style"/>
+          <w:rFonts w:ascii="Britannic Bold" w:hAnsi="Britannic Bold"/>
+          <w:color w:val="232323"/>
+          <w:sz w:val="32"/>
         </w:rPr>
         <w:t>this is one of the great chasms between planning and execution.</w:t>
       </w:r>
@@ -112,7 +143,9 @@
       </w:pPr>
       <w:r>
         <w:rPr>
-          <w:rStyle w:val="stego_style"/>
+          <w:rFonts w:ascii="Britannic Bold" w:hAnsi="Britannic Bold"/>
+          <w:color w:val="232323"/>
+          <w:sz w:val="32"/>
         </w:rPr>
         <w:br w:type="page"/>
       </w:r>
@@ -123,6 +156,11 @@
         <w:jc w:val="both"/>
       </w:pPr>
       <w:r>
+        <w:rPr>
+          <w:rFonts w:ascii="Britannic Bold" w:hAnsi="Britannic Bold"/>
+          <w:color w:val="232323"/>
+          <w:sz w:val="32"/>
+        </w:rPr>
         <w:lastRenderedPageBreak/>
         <w:t>Cunning</w:t>
       </w:r>
@@ -133,7 +171,9 @@
       </w:pPr>
       <w:r>
         <w:rPr>
-          <w:rStyle w:val="stego_style"/>
+          <w:rFonts w:ascii="Britannic Bold" w:hAnsi="Britannic Bold"/>
+          <w:color w:val="232323"/>
+          <w:sz w:val="32"/>
         </w:rPr>
         <w:t>The term "cunning" implies secret purpose. It contrasts with the straightforward, simple, direct approach much as wit contrasts with direct proof. Consequently, it has nothing in common with methods of persuasion, of self-interest, or of force, but a great deal with deceit, which also conceals its purpose. It is itself a form of deceit, when it is completed; yet not deceit in the ordinary sense of the word, since no outright breach of faith is involved. The use of a trick or stratagem permits the intended victim to make his own mistakes, which, combined in a single result, suddenly change the nature of the situation before his very eyes. It might be said, that, as wit juggles with ideas and beliefs, so cunning juggles with actions.</w:t>
       </w:r>
@@ -144,7 +184,9 @@
       </w:pPr>
       <w:r>
         <w:rPr>
-          <w:rStyle w:val="stego_style"/>
+          <w:rFonts w:ascii="Britannic Bold" w:hAnsi="Britannic Bold"/>
+          <w:color w:val="232323"/>
+          <w:sz w:val="32"/>
         </w:rPr>
         <w:t xml:space="preserve">At first glance, it seems not unjust that the term "strategy" should be derived from "cunning" and that, for all the real and apparent changes that war has undergone since the days of ancient Greece, this term still indicates its essential nature. </w:t>
       </w:r>
@@ -155,7 +197,9 @@
       </w:pPr>
       <w:r>
         <w:rPr>
-          <w:rStyle w:val="stego_style"/>
+          <w:rFonts w:ascii="Britannic Bold" w:hAnsi="Britannic Bold"/>
+          <w:color w:val="232323"/>
+          <w:sz w:val="32"/>
         </w:rPr>
         <w:t>If we leave the actual execution of force, the engagement, to tactics, and consider strategy as the art of skilfully exploiting force for a larger purpose, and if we disregard for the moment such characteristics as fierce ambition which acts like a compressed spring, great will-power which yields only reluctantly, etc., no human characteristic appears so suited to the task of directing and inspiring strategy as the gift of cunning. The universal urge to surprise, discussed in the previous chapter, already points to this conclusion: since each surprise action is rooted in at least some degree of cunning.</w:t>
       </w:r>
@@ -166,7 +210,9 @@
       </w:pPr>
       <w:r>
         <w:rPr>
-          <w:rStyle w:val="stego_style"/>
+          <w:rFonts w:ascii="Britannic Bold" w:hAnsi="Britannic Bold"/>
+          <w:color w:val="232323"/>
+          <w:sz w:val="32"/>
         </w:rPr>
         <w:t>Yet however much one longs to see opposing generals vie with one another in craft, cleverness, and cunning, the fact remains that these qualities do not figure prominently in the history of war. Rarely do they stand out amid the welter of events and circumstances.</w:t>
       </w:r>
@@ -177,7 +223,9 @@
       </w:pPr>
       <w:r>
         <w:rPr>
-          <w:rStyle w:val="stego_style"/>
+          <w:rFonts w:ascii="Britannic Bold" w:hAnsi="Britannic Bold"/>
+          <w:color w:val="232323"/>
+          <w:sz w:val="32"/>
         </w:rPr>
         <w:t>The reason for this is obvious and is closely related to the substance of the previous chapter.</w:t>
       </w:r>
@@ -188,7 +236,9 @@
       </w:pPr>
       <w:r>
         <w:rPr>
-          <w:rStyle w:val="stego_style"/>
+          <w:rFonts w:ascii="Britannic Bold" w:hAnsi="Britannic Bold"/>
+          <w:color w:val="232323"/>
+          <w:sz w:val="32"/>
         </w:rPr>
         <w:t>Strategy is exclusively concerned with engagements and with the directions relating to them. Unlike other areas of life, it is not concerned with actions that consist only of words, such as statements, declarations, and so forth. But words, being cheap, are the most common means of creating false impressions.</w:t>
       </w:r>
@@ -199,7 +249,9 @@
       </w:pPr>
       <w:r>
         <w:rPr>
-          <w:rStyle w:val="stego_style"/>
+          <w:rFonts w:ascii="Britannic Bold" w:hAnsi="Britannic Bold"/>
+          <w:color w:val="232323"/>
+          <w:sz w:val="32"/>
         </w:rPr>
         <w:t>Analogous things in war-plans and orders issued for appearances only, false reports designed to confuse the enemy, etc.-have as a rule so little strategic value that they are used only if a ready-made opportunity presents itself. They should not be considered as a significant independent field of action at the disposal of the commander.</w:t>
       </w:r>
@@ -210,7 +262,9 @@
       </w:pPr>
       <w:r>
         <w:rPr>
-          <w:rStyle w:val="stego_style"/>
+          <w:rFonts w:ascii="Britannic Bold" w:hAnsi="Britannic Bold"/>
+          <w:color w:val="232323"/>
+          <w:sz w:val="32"/>
         </w:rPr>
         <w:t>To prepare a sham action with sufficient thoroughness to impress an enemy requires a considerable expenditure of time and effort, and the costs increase with scale of the deception. Normally they call for more than can be spared, and consequently so-called strategic feints rarely have the desired effect. It is dangerous, in fact, to use substantial forces over any length of time merely to create an illusion; there is always the risk that nothing will be gained and that the troops deployed will not be available when they are really needed.</w:t>
       </w:r>
@@ -221,7 +275,9 @@
       </w:pPr>
       <w:r>
         <w:rPr>
-          <w:rStyle w:val="stego_style"/>
+          <w:rFonts w:ascii="Britannic Bold" w:hAnsi="Britannic Bold"/>
+          <w:color w:val="232323"/>
+          <w:sz w:val="32"/>
         </w:rPr>
         <w:lastRenderedPageBreak/>
         <w:t>In war generals are always mindful of this sobering truth and thus tend to lose the urge to play with sly mobility. Stern necessity usually permeates direct action to such an extent that no room is left for such a game. In brief, the strategist's chessmen do not have the kind of mobility that is essential for stratagem and cunning.</w:t>
@@ -233,7 +289,9 @@
       </w:pPr>
       <w:r>
         <w:rPr>
-          <w:rStyle w:val="stego_style"/>
+          <w:rFonts w:ascii="Britannic Bold" w:hAnsi="Britannic Bold"/>
+          <w:color w:val="232323"/>
+          <w:sz w:val="32"/>
         </w:rPr>
         <w:t>We conclude that an accurate and penetrating understanding is a more useful and essential asset for the commander than any gift for cunning though the latter will do no harm so long as it is not employed, as it all too often is, at the expense of more essential qualities of character.</w:t>
       </w:r>
@@ -244,1443 +302,1689 @@
       </w:pPr>
       <w:r>
         <w:rPr>
-          <w:rStyle w:val="stego_style"/>
-          <w:color w:val="020001"/>
+          <w:rFonts w:ascii="Britannic Bold" w:hAnsi="Britannic Bold"/>
+          <w:color w:val="232323"/>
+          <w:sz w:val="32"/>
         </w:rPr>
         <w:t>H</w:t>
       </w:r>
       <w:r>
         <w:rPr>
-          <w:rStyle w:val="stego_style"/>
-          <w:color w:val="030400"/>
+          <w:rFonts w:ascii="Britannic Bold" w:hAnsi="Britannic Bold"/>
+          <w:color w:val="232323"/>
+          <w:sz w:val="32"/>
         </w:rPr>
         <w:t>o</w:t>
       </w:r>
       <w:r>
         <w:rPr>
-          <w:rStyle w:val="stego_style"/>
-          <w:color w:val="030400"/>
+          <w:rFonts w:ascii="Britannic Bold" w:hAnsi="Britannic Bold"/>
+          <w:color w:val="232323"/>
+          <w:sz w:val="32"/>
         </w:rPr>
         <w:t>w</w:t>
       </w:r>
       <w:r>
         <w:rPr>
-          <w:rStyle w:val="stego_style"/>
-          <w:color w:val="030001"/>
+          <w:rFonts w:ascii="Britannic Bold" w:hAnsi="Britannic Bold"/>
+          <w:color w:val="232323"/>
+          <w:sz w:val="32"/>
         </w:rPr>
         <w:t>e</w:t>
       </w:r>
       <w:r>
         <w:rPr>
-          <w:rStyle w:val="stego_style"/>
-          <w:color w:val="030402"/>
+          <w:rFonts w:ascii="Britannic Bold" w:hAnsi="Britannic Bold"/>
+          <w:color w:val="232323"/>
+          <w:sz w:val="32"/>
         </w:rPr>
         <w:t>v</w:t>
       </w:r>
       <w:r>
         <w:rPr>
-          <w:rStyle w:val="stego_style"/>
-          <w:color w:val="030101"/>
+          <w:rFonts w:ascii="Britannic Bold" w:hAnsi="Britannic Bold"/>
+          <w:color w:val="232323"/>
+          <w:sz w:val="32"/>
         </w:rPr>
         <w:t>e</w:t>
       </w:r>
       <w:r>
         <w:rPr>
-          <w:rStyle w:val="stego_style"/>
-          <w:color w:val="030302"/>
+          <w:rFonts w:ascii="Britannic Bold" w:hAnsi="Britannic Bold"/>
+          <w:color w:val="232323"/>
+          <w:sz w:val="32"/>
         </w:rPr>
         <w:t>r</w:t>
       </w:r>
       <w:r>
         <w:rPr>
-          <w:rStyle w:val="stego_style"/>
-          <w:color w:val="030500"/>
+          <w:rFonts w:ascii="Britannic Bold" w:hAnsi="Britannic Bold"/>
+          <w:color w:val="232323"/>
+          <w:sz w:val="32"/>
         </w:rPr>
         <w:t>,</w:t>
       </w:r>
       <w:r>
         <w:rPr>
-          <w:rStyle w:val="stego_style"/>
-        </w:rPr>
-        <w:t xml:space="preserve"> </w:t>
-      </w:r>
-      <w:r>
-        <w:rPr>
-          <w:rStyle w:val="stego_style"/>
-          <w:color w:val="030300"/>
+          <w:rFonts w:ascii="Britannic Bold" w:hAnsi="Britannic Bold"/>
+          <w:color w:val="232323"/>
+          <w:sz w:val="32"/>
+        </w:rPr>
+        <w:t xml:space="preserve"> </w:t>
+      </w:r>
+      <w:r>
+        <w:rPr>
+          <w:rFonts w:ascii="Britannic Bold" w:hAnsi="Britannic Bold"/>
+          <w:color w:val="232323"/>
+          <w:sz w:val="32"/>
         </w:rPr>
         <w:t>t</w:t>
       </w:r>
       <w:r>
         <w:rPr>
-          <w:rStyle w:val="stego_style"/>
-          <w:color w:val="030601"/>
+          <w:rFonts w:ascii="Britannic Bold" w:hAnsi="Britannic Bold"/>
+          <w:color w:val="232323"/>
+          <w:sz w:val="32"/>
         </w:rPr>
         <w:t>h</w:t>
       </w:r>
       <w:r>
         <w:rPr>
-          <w:rStyle w:val="stego_style"/>
-          <w:color w:val="010000"/>
+          <w:rFonts w:ascii="Britannic Bold" w:hAnsi="Britannic Bold"/>
+          <w:color w:val="232323"/>
+          <w:sz w:val="32"/>
         </w:rPr>
         <w:t>e</w:t>
       </w:r>
       <w:r>
         <w:rPr>
-          <w:rStyle w:val="stego_style"/>
-        </w:rPr>
-        <w:t xml:space="preserve"> </w:t>
-      </w:r>
-      <w:r>
-        <w:rPr>
-          <w:rStyle w:val="stego_style"/>
-          <w:color w:val="030302"/>
+          <w:rFonts w:ascii="Britannic Bold" w:hAnsi="Britannic Bold"/>
+          <w:color w:val="232323"/>
+          <w:sz w:val="32"/>
+        </w:rPr>
+        <w:t xml:space="preserve"> </w:t>
+      </w:r>
+      <w:r>
+        <w:rPr>
+          <w:rFonts w:ascii="Britannic Bold" w:hAnsi="Britannic Bold"/>
+          <w:color w:val="232323"/>
+          <w:sz w:val="32"/>
         </w:rPr>
         <w:t>w</w:t>
       </w:r>
       <w:r>
         <w:rPr>
-          <w:rStyle w:val="stego_style"/>
-          <w:color w:val="030101"/>
+          <w:rFonts w:ascii="Britannic Bold" w:hAnsi="Britannic Bold"/>
+          <w:color w:val="232323"/>
+          <w:sz w:val="32"/>
         </w:rPr>
         <w:t>e</w:t>
       </w:r>
       <w:r>
         <w:rPr>
-          <w:rStyle w:val="stego_style"/>
-          <w:color w:val="030501"/>
+          <w:rFonts w:ascii="Britannic Bold" w:hAnsi="Britannic Bold"/>
+          <w:color w:val="232323"/>
+          <w:sz w:val="32"/>
         </w:rPr>
         <w:t>a</w:t>
       </w:r>
       <w:r>
         <w:rPr>
-          <w:rStyle w:val="stego_style"/>
-          <w:color w:val="030500"/>
+          <w:rFonts w:ascii="Britannic Bold" w:hAnsi="Britannic Bold"/>
+          <w:color w:val="232323"/>
+          <w:sz w:val="32"/>
         </w:rPr>
         <w:t>k</w:t>
       </w:r>
       <w:r>
         <w:rPr>
-          <w:rStyle w:val="stego_style"/>
-          <w:color w:val="030402"/>
+          <w:rFonts w:ascii="Britannic Bold" w:hAnsi="Britannic Bold"/>
+          <w:color w:val="232323"/>
+          <w:sz w:val="32"/>
         </w:rPr>
         <w:t>e</w:t>
       </w:r>
       <w:r>
         <w:rPr>
-          <w:rStyle w:val="stego_style"/>
-          <w:color w:val="030001"/>
+          <w:rFonts w:ascii="Britannic Bold" w:hAnsi="Britannic Bold"/>
+          <w:color w:val="232323"/>
+          <w:sz w:val="32"/>
         </w:rPr>
         <w:t>r</w:t>
       </w:r>
       <w:r>
         <w:rPr>
-          <w:rStyle w:val="stego_style"/>
-        </w:rPr>
-        <w:t xml:space="preserve"> </w:t>
-      </w:r>
-      <w:r>
-        <w:rPr>
-          <w:rStyle w:val="stego_style"/>
-          <w:color w:val="030300"/>
+          <w:rFonts w:ascii="Britannic Bold" w:hAnsi="Britannic Bold"/>
+          <w:color w:val="232323"/>
+          <w:sz w:val="32"/>
+        </w:rPr>
+        <w:t xml:space="preserve"> </w:t>
+      </w:r>
+      <w:r>
+        <w:rPr>
+          <w:rFonts w:ascii="Britannic Bold" w:hAnsi="Britannic Bold"/>
+          <w:color w:val="232323"/>
+          <w:sz w:val="32"/>
         </w:rPr>
         <w:t>t</w:t>
       </w:r>
       <w:r>
         <w:rPr>
-          <w:rStyle w:val="stego_style"/>
-          <w:color w:val="010103"/>
+          <w:rFonts w:ascii="Britannic Bold" w:hAnsi="Britannic Bold"/>
+          <w:color w:val="232323"/>
+          <w:sz w:val="32"/>
         </w:rPr>
         <w:t>h</w:t>
       </w:r>
       <w:r>
         <w:rPr>
-          <w:rStyle w:val="stego_style"/>
-          <w:color w:val="030403"/>
+          <w:rFonts w:ascii="Britannic Bold" w:hAnsi="Britannic Bold"/>
+          <w:color w:val="232323"/>
+          <w:sz w:val="32"/>
         </w:rPr>
         <w:t>e</w:t>
       </w:r>
       <w:r>
         <w:rPr>
-          <w:rStyle w:val="stego_style"/>
-        </w:rPr>
-        <w:t xml:space="preserve"> </w:t>
-      </w:r>
-      <w:r>
-        <w:rPr>
-          <w:rStyle w:val="stego_style"/>
-          <w:color w:val="010000"/>
+          <w:rFonts w:ascii="Britannic Bold" w:hAnsi="Britannic Bold"/>
+          <w:color w:val="232323"/>
+          <w:sz w:val="32"/>
+        </w:rPr>
+        <w:t xml:space="preserve"> </w:t>
+      </w:r>
+      <w:r>
+        <w:rPr>
+          <w:rFonts w:ascii="Britannic Bold" w:hAnsi="Britannic Bold"/>
+          <w:color w:val="232323"/>
+          <w:sz w:val="32"/>
         </w:rPr>
         <w:t>f</w:t>
       </w:r>
       <w:r>
         <w:rPr>
-          <w:rStyle w:val="stego_style"/>
-          <w:color w:val="030400"/>
+          <w:rFonts w:ascii="Britannic Bold" w:hAnsi="Britannic Bold"/>
+          <w:color w:val="232323"/>
+          <w:sz w:val="32"/>
         </w:rPr>
         <w:t>o</w:t>
       </w:r>
       <w:r>
         <w:rPr>
-          <w:rStyle w:val="stego_style"/>
-          <w:color w:val="030402"/>
+          <w:rFonts w:ascii="Britannic Bold" w:hAnsi="Britannic Bold"/>
+          <w:color w:val="232323"/>
+          <w:sz w:val="32"/>
         </w:rPr>
         <w:t>r</w:t>
       </w:r>
       <w:r>
         <w:rPr>
-          <w:rStyle w:val="stego_style"/>
-          <w:color w:val="030303"/>
+          <w:rFonts w:ascii="Britannic Bold" w:hAnsi="Britannic Bold"/>
+          <w:color w:val="232323"/>
+          <w:sz w:val="32"/>
         </w:rPr>
         <w:t>c</w:t>
       </w:r>
       <w:r>
         <w:rPr>
-          <w:rStyle w:val="stego_style"/>
-          <w:color w:val="030500"/>
+          <w:rFonts w:ascii="Britannic Bold" w:hAnsi="Britannic Bold"/>
+          <w:color w:val="232323"/>
+          <w:sz w:val="32"/>
         </w:rPr>
         <w:t>e</w:t>
       </w:r>
       <w:r>
         <w:rPr>
-          <w:rStyle w:val="stego_style"/>
-          <w:color w:val="030101"/>
+          <w:rFonts w:ascii="Britannic Bold" w:hAnsi="Britannic Bold"/>
+          <w:color w:val="232323"/>
+          <w:sz w:val="32"/>
         </w:rPr>
         <w:t>s</w:t>
       </w:r>
       <w:r>
         <w:rPr>
-          <w:rStyle w:val="stego_style"/>
-        </w:rPr>
-        <w:t xml:space="preserve"> </w:t>
-      </w:r>
-      <w:r>
-        <w:rPr>
-          <w:rStyle w:val="stego_style"/>
-          <w:color w:val="030403"/>
+          <w:rFonts w:ascii="Britannic Bold" w:hAnsi="Britannic Bold"/>
+          <w:color w:val="232323"/>
+          <w:sz w:val="32"/>
+        </w:rPr>
+        <w:t xml:space="preserve"> </w:t>
+      </w:r>
+      <w:r>
+        <w:rPr>
+          <w:rFonts w:ascii="Britannic Bold" w:hAnsi="Britannic Bold"/>
+          <w:color w:val="232323"/>
+          <w:sz w:val="32"/>
         </w:rPr>
         <w:t>t</w:t>
       </w:r>
       <w:r>
         <w:rPr>
-          <w:rStyle w:val="stego_style"/>
-          <w:color w:val="030500"/>
+          <w:rFonts w:ascii="Britannic Bold" w:hAnsi="Britannic Bold"/>
+          <w:color w:val="232323"/>
+          <w:sz w:val="32"/>
         </w:rPr>
         <w:t>h</w:t>
       </w:r>
       <w:r>
         <w:rPr>
-          <w:rStyle w:val="stego_style"/>
-          <w:color w:val="010000"/>
+          <w:rFonts w:ascii="Britannic Bold" w:hAnsi="Britannic Bold"/>
+          <w:color w:val="232323"/>
+          <w:sz w:val="32"/>
         </w:rPr>
         <w:t>a</w:t>
       </w:r>
       <w:r>
         <w:rPr>
-          <w:rStyle w:val="stego_style"/>
-          <w:color w:val="030201"/>
+          <w:rFonts w:ascii="Britannic Bold" w:hAnsi="Britannic Bold"/>
+          <w:color w:val="232323"/>
+          <w:sz w:val="32"/>
         </w:rPr>
         <w:t>t</w:t>
       </w:r>
       <w:r>
         <w:rPr>
-          <w:rStyle w:val="stego_style"/>
-        </w:rPr>
-        <w:t xml:space="preserve"> </w:t>
-      </w:r>
-      <w:r>
-        <w:rPr>
-          <w:rStyle w:val="stego_style"/>
-          <w:color w:val="030403"/>
+          <w:rFonts w:ascii="Britannic Bold" w:hAnsi="Britannic Bold"/>
+          <w:color w:val="232323"/>
+          <w:sz w:val="32"/>
+        </w:rPr>
+        <w:t xml:space="preserve"> </w:t>
+      </w:r>
+      <w:r>
+        <w:rPr>
+          <w:rFonts w:ascii="Britannic Bold" w:hAnsi="Britannic Bold"/>
+          <w:color w:val="232323"/>
+          <w:sz w:val="32"/>
         </w:rPr>
         <w:t>a</w:t>
       </w:r>
       <w:r>
         <w:rPr>
-          <w:rStyle w:val="stego_style"/>
-          <w:color w:val="010000"/>
+          <w:rFonts w:ascii="Britannic Bold" w:hAnsi="Britannic Bold"/>
+          <w:color w:val="232323"/>
+          <w:sz w:val="32"/>
         </w:rPr>
         <w:t>r</w:t>
       </w:r>
       <w:r>
         <w:rPr>
-          <w:rStyle w:val="stego_style"/>
-          <w:color w:val="030500"/>
+          <w:rFonts w:ascii="Britannic Bold" w:hAnsi="Britannic Bold"/>
+          <w:color w:val="232323"/>
+          <w:sz w:val="32"/>
         </w:rPr>
         <w:t>e</w:t>
       </w:r>
       <w:r>
         <w:rPr>
-          <w:rStyle w:val="stego_style"/>
-        </w:rPr>
-        <w:t xml:space="preserve"> </w:t>
-      </w:r>
-      <w:r>
-        <w:rPr>
-          <w:rStyle w:val="stego_style"/>
-          <w:color w:val="030200"/>
+          <w:rFonts w:ascii="Britannic Bold" w:hAnsi="Britannic Bold"/>
+          <w:color w:val="232323"/>
+          <w:sz w:val="32"/>
+        </w:rPr>
+        <w:t xml:space="preserve"> </w:t>
+      </w:r>
+      <w:r>
+        <w:rPr>
+          <w:rFonts w:ascii="Britannic Bold" w:hAnsi="Britannic Bold"/>
+          <w:color w:val="232323"/>
+          <w:sz w:val="32"/>
         </w:rPr>
         <w:t>a</w:t>
       </w:r>
       <w:r>
         <w:rPr>
-          <w:rStyle w:val="stego_style"/>
-          <w:color w:val="030303"/>
+          <w:rFonts w:ascii="Britannic Bold" w:hAnsi="Britannic Bold"/>
+          <w:color w:val="232323"/>
+          <w:sz w:val="32"/>
         </w:rPr>
         <w:t>t</w:t>
       </w:r>
       <w:r>
         <w:rPr>
-          <w:rStyle w:val="stego_style"/>
-        </w:rPr>
-        <w:t xml:space="preserve"> </w:t>
-      </w:r>
-      <w:r>
-        <w:rPr>
-          <w:rStyle w:val="stego_style"/>
-          <w:color w:val="030402"/>
+          <w:rFonts w:ascii="Britannic Bold" w:hAnsi="Britannic Bold"/>
+          <w:color w:val="232323"/>
+          <w:sz w:val="32"/>
+        </w:rPr>
+        <w:t xml:space="preserve"> </w:t>
+      </w:r>
+      <w:r>
+        <w:rPr>
+          <w:rFonts w:ascii="Britannic Bold" w:hAnsi="Britannic Bold"/>
+          <w:color w:val="232323"/>
+          <w:sz w:val="32"/>
         </w:rPr>
         <w:t>t</w:t>
       </w:r>
       <w:r>
         <w:rPr>
-          <w:rStyle w:val="stego_style"/>
-          <w:color w:val="030303"/>
+          <w:rFonts w:ascii="Britannic Bold" w:hAnsi="Britannic Bold"/>
+          <w:color w:val="232323"/>
+          <w:sz w:val="32"/>
         </w:rPr>
         <w:t>h</w:t>
       </w:r>
       <w:r>
         <w:rPr>
-          <w:rStyle w:val="stego_style"/>
-          <w:color w:val="030501"/>
+          <w:rFonts w:ascii="Britannic Bold" w:hAnsi="Britannic Bold"/>
+          <w:color w:val="232323"/>
+          <w:sz w:val="32"/>
         </w:rPr>
         <w:t>e</w:t>
       </w:r>
       <w:r>
         <w:rPr>
-          <w:rStyle w:val="stego_style"/>
-        </w:rPr>
-        <w:t xml:space="preserve"> </w:t>
-      </w:r>
-      <w:r>
-        <w:rPr>
-          <w:rStyle w:val="stego_style"/>
-          <w:color w:val="030103"/>
+          <w:rFonts w:ascii="Britannic Bold" w:hAnsi="Britannic Bold"/>
+          <w:color w:val="232323"/>
+          <w:sz w:val="32"/>
+        </w:rPr>
+        <w:t xml:space="preserve"> </w:t>
+      </w:r>
+      <w:r>
+        <w:rPr>
+          <w:rFonts w:ascii="Britannic Bold" w:hAnsi="Britannic Bold"/>
+          <w:color w:val="232323"/>
+          <w:sz w:val="32"/>
         </w:rPr>
         <w:t>d</w:t>
       </w:r>
       <w:r>
         <w:rPr>
-          <w:rStyle w:val="stego_style"/>
-          <w:color w:val="030200"/>
+          <w:rFonts w:ascii="Britannic Bold" w:hAnsi="Britannic Bold"/>
+          <w:color w:val="232323"/>
+          <w:sz w:val="32"/>
         </w:rPr>
         <w:t>i</w:t>
       </w:r>
       <w:r>
         <w:rPr>
-          <w:rStyle w:val="stego_style"/>
-          <w:color w:val="030300"/>
+          <w:rFonts w:ascii="Britannic Bold" w:hAnsi="Britannic Bold"/>
+          <w:color w:val="232323"/>
+          <w:sz w:val="32"/>
         </w:rPr>
         <w:t>s</w:t>
       </w:r>
       <w:r>
         <w:rPr>
-          <w:rStyle w:val="stego_style"/>
-          <w:color w:val="030601"/>
+          <w:rFonts w:ascii="Britannic Bold" w:hAnsi="Britannic Bold"/>
+          <w:color w:val="232323"/>
+          <w:sz w:val="32"/>
         </w:rPr>
         <w:t>p</w:t>
       </w:r>
       <w:r>
         <w:rPr>
-          <w:rStyle w:val="stego_style"/>
-          <w:color w:val="010000"/>
+          <w:rFonts w:ascii="Britannic Bold" w:hAnsi="Britannic Bold"/>
+          <w:color w:val="232323"/>
+          <w:sz w:val="32"/>
         </w:rPr>
         <w:t>o</w:t>
       </w:r>
       <w:r>
         <w:rPr>
-          <w:rStyle w:val="stego_style"/>
-          <w:color w:val="030100"/>
+          <w:rFonts w:ascii="Britannic Bold" w:hAnsi="Britannic Bold"/>
+          <w:color w:val="232323"/>
+          <w:sz w:val="32"/>
         </w:rPr>
         <w:t>s</w:t>
       </w:r>
       <w:r>
         <w:rPr>
-          <w:rStyle w:val="stego_style"/>
-          <w:color w:val="030201"/>
+          <w:rFonts w:ascii="Britannic Bold" w:hAnsi="Britannic Bold"/>
+          <w:color w:val="232323"/>
+          <w:sz w:val="32"/>
         </w:rPr>
         <w:t>a</w:t>
       </w:r>
       <w:r>
         <w:rPr>
-          <w:rStyle w:val="stego_style"/>
-          <w:color w:val="030403"/>
+          <w:rFonts w:ascii="Britannic Bold" w:hAnsi="Britannic Bold"/>
+          <w:color w:val="232323"/>
+          <w:sz w:val="32"/>
         </w:rPr>
         <w:t>l</w:t>
       </w:r>
       <w:r>
         <w:rPr>
-          <w:rStyle w:val="stego_style"/>
-        </w:rPr>
-        <w:t xml:space="preserve"> </w:t>
-      </w:r>
-      <w:r>
-        <w:rPr>
-          <w:rStyle w:val="stego_style"/>
-          <w:color w:val="030003"/>
+          <w:rFonts w:ascii="Britannic Bold" w:hAnsi="Britannic Bold"/>
+          <w:color w:val="232323"/>
+          <w:sz w:val="32"/>
+        </w:rPr>
+        <w:t xml:space="preserve"> </w:t>
+      </w:r>
+      <w:r>
+        <w:rPr>
+          <w:rFonts w:ascii="Britannic Bold" w:hAnsi="Britannic Bold"/>
+          <w:color w:val="232323"/>
+          <w:sz w:val="32"/>
         </w:rPr>
         <w:t>o</w:t>
       </w:r>
       <w:r>
         <w:rPr>
-          <w:rStyle w:val="stego_style"/>
-          <w:color w:val="030303"/>
+          <w:rFonts w:ascii="Britannic Bold" w:hAnsi="Britannic Bold"/>
+          <w:color w:val="232323"/>
+          <w:sz w:val="32"/>
         </w:rPr>
         <w:t>f</w:t>
       </w:r>
       <w:r>
         <w:rPr>
-          <w:rStyle w:val="stego_style"/>
-        </w:rPr>
-        <w:t xml:space="preserve"> </w:t>
-      </w:r>
-      <w:r>
-        <w:rPr>
-          <w:rStyle w:val="stego_style"/>
-          <w:color w:val="030501"/>
+          <w:rFonts w:ascii="Britannic Bold" w:hAnsi="Britannic Bold"/>
+          <w:color w:val="232323"/>
+          <w:sz w:val="32"/>
+        </w:rPr>
+        <w:t xml:space="preserve"> </w:t>
+      </w:r>
+      <w:r>
+        <w:rPr>
+          <w:rFonts w:ascii="Britannic Bold" w:hAnsi="Britannic Bold"/>
+          <w:color w:val="232323"/>
+          <w:sz w:val="32"/>
         </w:rPr>
         <w:t>t</w:t>
       </w:r>
       <w:r>
         <w:rPr>
-          <w:rStyle w:val="stego_style"/>
-          <w:color w:val="030302"/>
+          <w:rFonts w:ascii="Britannic Bold" w:hAnsi="Britannic Bold"/>
+          <w:color w:val="232323"/>
+          <w:sz w:val="32"/>
         </w:rPr>
         <w:t>h</w:t>
       </w:r>
       <w:r>
         <w:rPr>
-          <w:rStyle w:val="stego_style"/>
-          <w:color w:val="030500"/>
+          <w:rFonts w:ascii="Britannic Bold" w:hAnsi="Britannic Bold"/>
+          <w:color w:val="232323"/>
+          <w:sz w:val="32"/>
         </w:rPr>
         <w:t>e</w:t>
       </w:r>
       <w:r>
         <w:rPr>
-          <w:rStyle w:val="stego_style"/>
-        </w:rPr>
-        <w:t xml:space="preserve"> </w:t>
-      </w:r>
-      <w:r>
-        <w:rPr>
-          <w:rStyle w:val="stego_style"/>
-          <w:color w:val="030101"/>
+          <w:rFonts w:ascii="Britannic Bold" w:hAnsi="Britannic Bold"/>
+          <w:color w:val="232323"/>
+          <w:sz w:val="32"/>
+        </w:rPr>
+        <w:t xml:space="preserve"> </w:t>
+      </w:r>
+      <w:r>
+        <w:rPr>
+          <w:rFonts w:ascii="Britannic Bold" w:hAnsi="Britannic Bold"/>
+          <w:color w:val="232323"/>
+          <w:sz w:val="32"/>
         </w:rPr>
         <w:t>s</w:t>
       </w:r>
       <w:r>
         <w:rPr>
-          <w:rStyle w:val="stego_style"/>
-          <w:color w:val="030100"/>
+          <w:rFonts w:ascii="Britannic Bold" w:hAnsi="Britannic Bold"/>
+          <w:color w:val="232323"/>
+          <w:sz w:val="32"/>
         </w:rPr>
         <w:t>u</w:t>
       </w:r>
       <w:r>
         <w:rPr>
-          <w:rStyle w:val="stego_style"/>
-          <w:color w:val="010000"/>
+          <w:rFonts w:ascii="Britannic Bold" w:hAnsi="Britannic Bold"/>
+          <w:color w:val="232323"/>
+          <w:sz w:val="32"/>
         </w:rPr>
         <w:t>p</w:t>
       </w:r>
       <w:r>
         <w:rPr>
-          <w:rStyle w:val="stego_style"/>
-          <w:color w:val="030001"/>
+          <w:rFonts w:ascii="Britannic Bold" w:hAnsi="Britannic Bold"/>
+          <w:color w:val="232323"/>
+          <w:sz w:val="32"/>
         </w:rPr>
         <w:t>r</w:t>
       </w:r>
       <w:r>
         <w:rPr>
-          <w:rStyle w:val="stego_style"/>
-          <w:color w:val="030302"/>
+          <w:rFonts w:ascii="Britannic Bold" w:hAnsi="Britannic Bold"/>
+          <w:color w:val="232323"/>
+          <w:sz w:val="32"/>
         </w:rPr>
         <w:t>e</w:t>
       </w:r>
       <w:r>
         <w:rPr>
-          <w:rStyle w:val="stego_style"/>
-          <w:color w:val="030100"/>
+          <w:rFonts w:ascii="Britannic Bold" w:hAnsi="Britannic Bold"/>
+          <w:color w:val="232323"/>
+          <w:sz w:val="32"/>
         </w:rPr>
         <w:t>m</w:t>
       </w:r>
       <w:r>
         <w:rPr>
-          <w:rStyle w:val="stego_style"/>
-          <w:color w:val="010000"/>
+          <w:rFonts w:ascii="Britannic Bold" w:hAnsi="Britannic Bold"/>
+          <w:color w:val="232323"/>
+          <w:sz w:val="32"/>
         </w:rPr>
         <w:t>e</w:t>
       </w:r>
       <w:r>
         <w:rPr>
-          <w:rStyle w:val="stego_style"/>
-        </w:rPr>
-        <w:t xml:space="preserve"> </w:t>
-      </w:r>
-      <w:r>
-        <w:rPr>
-          <w:rStyle w:val="stego_style"/>
-          <w:color w:val="030201"/>
+          <w:rFonts w:ascii="Britannic Bold" w:hAnsi="Britannic Bold"/>
+          <w:color w:val="232323"/>
+          <w:sz w:val="32"/>
+        </w:rPr>
+        <w:t xml:space="preserve"> </w:t>
+      </w:r>
+      <w:r>
+        <w:rPr>
+          <w:rFonts w:ascii="Britannic Bold" w:hAnsi="Britannic Bold"/>
+          <w:color w:val="232323"/>
+          <w:sz w:val="32"/>
         </w:rPr>
         <w:t>c</w:t>
       </w:r>
       <w:r>
         <w:rPr>
-          <w:rStyle w:val="stego_style"/>
-          <w:color w:val="030103"/>
+          <w:rFonts w:ascii="Britannic Bold" w:hAnsi="Britannic Bold"/>
+          <w:color w:val="232323"/>
+          <w:sz w:val="32"/>
         </w:rPr>
         <w:t>o</w:t>
       </w:r>
       <w:r>
         <w:rPr>
-          <w:rStyle w:val="stego_style"/>
-          <w:color w:val="030302"/>
+          <w:rFonts w:ascii="Britannic Bold" w:hAnsi="Britannic Bold"/>
+          <w:color w:val="232323"/>
+          <w:sz w:val="32"/>
         </w:rPr>
         <w:t>m</w:t>
       </w:r>
       <w:r>
         <w:rPr>
-          <w:rStyle w:val="stego_style"/>
-          <w:color w:val="030303"/>
+          <w:rFonts w:ascii="Britannic Bold" w:hAnsi="Britannic Bold"/>
+          <w:color w:val="232323"/>
+          <w:sz w:val="32"/>
         </w:rPr>
         <w:t>m</w:t>
       </w:r>
       <w:r>
         <w:rPr>
-          <w:rStyle w:val="stego_style"/>
-          <w:color w:val="030402"/>
+          <w:rFonts w:ascii="Britannic Bold" w:hAnsi="Britannic Bold"/>
+          <w:color w:val="232323"/>
+          <w:sz w:val="32"/>
         </w:rPr>
         <w:t>a</w:t>
       </w:r>
       <w:r>
         <w:rPr>
-          <w:rStyle w:val="stego_style"/>
-          <w:color w:val="030101"/>
+          <w:rFonts w:ascii="Britannic Bold" w:hAnsi="Britannic Bold"/>
+          <w:color w:val="232323"/>
+          <w:sz w:val="32"/>
         </w:rPr>
         <w:t>n</w:t>
       </w:r>
       <w:r>
         <w:rPr>
-          <w:rStyle w:val="stego_style"/>
-          <w:color w:val="030100"/>
+          <w:rFonts w:ascii="Britannic Bold" w:hAnsi="Britannic Bold"/>
+          <w:color w:val="232323"/>
+          <w:sz w:val="32"/>
         </w:rPr>
         <w:t>d</w:t>
       </w:r>
       <w:r>
         <w:rPr>
-          <w:rStyle w:val="stego_style"/>
-          <w:color w:val="010302"/>
+          <w:rFonts w:ascii="Britannic Bold" w:hAnsi="Britannic Bold"/>
+          <w:color w:val="232323"/>
+          <w:sz w:val="32"/>
         </w:rPr>
         <w:t>e</w:t>
       </w:r>
       <w:r>
         <w:rPr>
-          <w:rStyle w:val="stego_style"/>
-          <w:color w:val="010000"/>
+          <w:rFonts w:ascii="Britannic Bold" w:hAnsi="Britannic Bold"/>
+          <w:color w:val="232323"/>
+          <w:sz w:val="32"/>
         </w:rPr>
         <w:t>r</w:t>
       </w:r>
       <w:r>
         <w:rPr>
-          <w:rStyle w:val="stego_style"/>
-          <w:color w:val="020201"/>
+          <w:rFonts w:ascii="Britannic Bold" w:hAnsi="Britannic Bold"/>
+          <w:color w:val="232323"/>
+          <w:sz w:val="32"/>
         </w:rPr>
         <w:t>,</w:t>
       </w:r>
       <w:r>
         <w:rPr>
-          <w:rStyle w:val="stego_style"/>
-        </w:rPr>
-        <w:t xml:space="preserve"> </w:t>
-      </w:r>
-      <w:r>
-        <w:rPr>
-          <w:rStyle w:val="stego_style"/>
-          <w:color w:val="030403"/>
+          <w:rFonts w:ascii="Britannic Bold" w:hAnsi="Britannic Bold"/>
+          <w:color w:val="232323"/>
+          <w:sz w:val="32"/>
+        </w:rPr>
+        <w:t xml:space="preserve"> </w:t>
+      </w:r>
+      <w:r>
+        <w:rPr>
+          <w:rFonts w:ascii="Britannic Bold" w:hAnsi="Britannic Bold"/>
+          <w:color w:val="232323"/>
+          <w:sz w:val="32"/>
         </w:rPr>
         <w:t>t</w:t>
       </w:r>
       <w:r>
         <w:rPr>
-          <w:rStyle w:val="stego_style"/>
-          <w:color w:val="030301"/>
+          <w:rFonts w:ascii="Britannic Bold" w:hAnsi="Britannic Bold"/>
+          <w:color w:val="232323"/>
+          <w:sz w:val="32"/>
         </w:rPr>
         <w:t>h</w:t>
       </w:r>
       <w:r>
         <w:rPr>
-          <w:rStyle w:val="stego_style"/>
-          <w:color w:val="030001"/>
+          <w:rFonts w:ascii="Britannic Bold" w:hAnsi="Britannic Bold"/>
+          <w:color w:val="232323"/>
+          <w:sz w:val="32"/>
         </w:rPr>
         <w:t>e</w:t>
       </w:r>
       <w:r>
         <w:rPr>
-          <w:rStyle w:val="stego_style"/>
-        </w:rPr>
-        <w:t xml:space="preserve"> </w:t>
-      </w:r>
-      <w:r>
-        <w:rPr>
-          <w:rStyle w:val="stego_style"/>
-          <w:color w:val="030302"/>
+          <w:rFonts w:ascii="Britannic Bold" w:hAnsi="Britannic Bold"/>
+          <w:color w:val="232323"/>
+          <w:sz w:val="32"/>
+        </w:rPr>
+        <w:t xml:space="preserve"> </w:t>
+      </w:r>
+      <w:r>
+        <w:rPr>
+          <w:rFonts w:ascii="Britannic Bold" w:hAnsi="Britannic Bold"/>
+          <w:color w:val="232323"/>
+          <w:sz w:val="32"/>
         </w:rPr>
         <w:t>m</w:t>
       </w:r>
       <w:r>
         <w:rPr>
-          <w:rStyle w:val="stego_style"/>
-          <w:color w:val="010000"/>
+          <w:rFonts w:ascii="Britannic Bold" w:hAnsi="Britannic Bold"/>
+          <w:color w:val="232323"/>
+          <w:sz w:val="32"/>
         </w:rPr>
         <w:t>o</w:t>
       </w:r>
       <w:r>
         <w:rPr>
-          <w:rStyle w:val="stego_style"/>
-          <w:color w:val="030200"/>
+          <w:rFonts w:ascii="Britannic Bold" w:hAnsi="Britannic Bold"/>
+          <w:color w:val="232323"/>
+          <w:sz w:val="32"/>
         </w:rPr>
         <w:t>r</w:t>
       </w:r>
       <w:r>
         <w:rPr>
-          <w:rStyle w:val="stego_style"/>
-          <w:color w:val="030001"/>
+          <w:rFonts w:ascii="Britannic Bold" w:hAnsi="Britannic Bold"/>
+          <w:color w:val="232323"/>
+          <w:sz w:val="32"/>
         </w:rPr>
         <w:t>e</w:t>
       </w:r>
       <w:r>
         <w:rPr>
-          <w:rStyle w:val="stego_style"/>
-        </w:rPr>
-        <w:t xml:space="preserve"> </w:t>
-      </w:r>
-      <w:r>
-        <w:rPr>
-          <w:rStyle w:val="stego_style"/>
-          <w:color w:val="030402"/>
+          <w:rFonts w:ascii="Britannic Bold" w:hAnsi="Britannic Bold"/>
+          <w:color w:val="232323"/>
+          <w:sz w:val="32"/>
+        </w:rPr>
+        <w:t xml:space="preserve"> </w:t>
+      </w:r>
+      <w:r>
+        <w:rPr>
+          <w:rFonts w:ascii="Britannic Bold" w:hAnsi="Britannic Bold"/>
+          <w:color w:val="232323"/>
+          <w:sz w:val="32"/>
         </w:rPr>
         <w:t>a</w:t>
       </w:r>
       <w:r>
         <w:rPr>
-          <w:rStyle w:val="stego_style"/>
-          <w:color w:val="030100"/>
+          <w:rFonts w:ascii="Britannic Bold" w:hAnsi="Britannic Bold"/>
+          <w:color w:val="232323"/>
+          <w:sz w:val="32"/>
         </w:rPr>
         <w:t>p</w:t>
       </w:r>
       <w:r>
         <w:rPr>
-          <w:rStyle w:val="stego_style"/>
-          <w:color w:val="010000"/>
+          <w:rFonts w:ascii="Britannic Bold" w:hAnsi="Britannic Bold"/>
+          <w:color w:val="232323"/>
+          <w:sz w:val="32"/>
         </w:rPr>
         <w:t>p</w:t>
       </w:r>
       <w:r>
         <w:rPr>
-          <w:rStyle w:val="stego_style"/>
-          <w:color w:val="030200"/>
+          <w:rFonts w:ascii="Britannic Bold" w:hAnsi="Britannic Bold"/>
+          <w:color w:val="232323"/>
+          <w:sz w:val="32"/>
         </w:rPr>
         <w:t>e</w:t>
       </w:r>
       <w:r>
         <w:rPr>
-          <w:rStyle w:val="stego_style"/>
-          <w:color w:val="030201"/>
+          <w:rFonts w:ascii="Britannic Bold" w:hAnsi="Britannic Bold"/>
+          <w:color w:val="232323"/>
+          <w:sz w:val="32"/>
         </w:rPr>
         <w:t>a</w:t>
       </w:r>
       <w:r>
         <w:rPr>
-          <w:rStyle w:val="stego_style"/>
-          <w:color w:val="030500"/>
+          <w:rFonts w:ascii="Britannic Bold" w:hAnsi="Britannic Bold"/>
+          <w:color w:val="232323"/>
+          <w:sz w:val="32"/>
         </w:rPr>
         <w:t>l</w:t>
       </w:r>
       <w:r>
         <w:rPr>
-          <w:rStyle w:val="stego_style"/>
-          <w:color w:val="010302"/>
+          <w:rFonts w:ascii="Britannic Bold" w:hAnsi="Britannic Bold"/>
+          <w:color w:val="232323"/>
+          <w:sz w:val="32"/>
         </w:rPr>
         <w:t>i</w:t>
       </w:r>
       <w:r>
         <w:rPr>
-          <w:rStyle w:val="stego_style"/>
-          <w:color w:val="010000"/>
+          <w:rFonts w:ascii="Britannic Bold" w:hAnsi="Britannic Bold"/>
+          <w:color w:val="232323"/>
+          <w:sz w:val="32"/>
         </w:rPr>
         <w:t>n</w:t>
       </w:r>
       <w:r>
         <w:rPr>
-          <w:rStyle w:val="stego_style"/>
-          <w:color w:val="020002"/>
+          <w:rFonts w:ascii="Britannic Bold" w:hAnsi="Britannic Bold"/>
+          <w:color w:val="232323"/>
+          <w:sz w:val="32"/>
         </w:rPr>
         <w:t>g</w:t>
       </w:r>
       <w:r>
         <w:rPr>
-          <w:rStyle w:val="stego_style"/>
-        </w:rPr>
-        <w:t xml:space="preserve"> </w:t>
-      </w:r>
-      <w:r>
-        <w:rPr>
-          <w:rStyle w:val="stego_style"/>
-          <w:color w:val="030300"/>
+          <w:rFonts w:ascii="Britannic Bold" w:hAnsi="Britannic Bold"/>
+          <w:color w:val="232323"/>
+          <w:sz w:val="32"/>
+        </w:rPr>
+        <w:t xml:space="preserve"> </w:t>
+      </w:r>
+      <w:r>
+        <w:rPr>
+          <w:rFonts w:ascii="Britannic Bold" w:hAnsi="Britannic Bold"/>
+          <w:color w:val="232323"/>
+          <w:sz w:val="32"/>
         </w:rPr>
         <w:t>t</w:t>
       </w:r>
       <w:r>
         <w:rPr>
-          <w:rStyle w:val="stego_style"/>
-          <w:color w:val="030303"/>
+          <w:rFonts w:ascii="Britannic Bold" w:hAnsi="Britannic Bold"/>
+          <w:color w:val="232323"/>
+          <w:sz w:val="32"/>
         </w:rPr>
         <w:t>h</w:t>
       </w:r>
       <w:r>
         <w:rPr>
-          <w:rStyle w:val="stego_style"/>
-          <w:color w:val="030003"/>
+          <w:rFonts w:ascii="Britannic Bold" w:hAnsi="Britannic Bold"/>
+          <w:color w:val="232323"/>
+          <w:sz w:val="32"/>
         </w:rPr>
         <w:t>e</w:t>
       </w:r>
       <w:r>
         <w:rPr>
-          <w:rStyle w:val="stego_style"/>
-        </w:rPr>
-        <w:t xml:space="preserve"> </w:t>
-      </w:r>
-      <w:r>
-        <w:rPr>
-          <w:rStyle w:val="stego_style"/>
-          <w:color w:val="030203"/>
+          <w:rFonts w:ascii="Britannic Bold" w:hAnsi="Britannic Bold"/>
+          <w:color w:val="232323"/>
+          <w:sz w:val="32"/>
+        </w:rPr>
+        <w:t xml:space="preserve"> </w:t>
+      </w:r>
+      <w:r>
+        <w:rPr>
+          <w:rFonts w:ascii="Britannic Bold" w:hAnsi="Britannic Bold"/>
+          <w:color w:val="232323"/>
+          <w:sz w:val="32"/>
         </w:rPr>
         <w:t>u</w:t>
       </w:r>
       <w:r>
         <w:rPr>
-          <w:rStyle w:val="stego_style"/>
-          <w:color w:val="030001"/>
+          <w:rFonts w:ascii="Britannic Bold" w:hAnsi="Britannic Bold"/>
+          <w:color w:val="232323"/>
+          <w:sz w:val="32"/>
         </w:rPr>
         <w:t>s</w:t>
       </w:r>
       <w:r>
         <w:rPr>
-          <w:rStyle w:val="stego_style"/>
-          <w:color w:val="030100"/>
+          <w:rFonts w:ascii="Britannic Bold" w:hAnsi="Britannic Bold"/>
+          <w:color w:val="232323"/>
+          <w:sz w:val="32"/>
         </w:rPr>
         <w:t>e</w:t>
       </w:r>
       <w:r>
         <w:rPr>
-          <w:rStyle w:val="stego_style"/>
-        </w:rPr>
-        <w:t xml:space="preserve"> </w:t>
-      </w:r>
-      <w:r>
-        <w:rPr>
-          <w:rStyle w:val="stego_style"/>
-          <w:color w:val="030101"/>
+          <w:rFonts w:ascii="Britannic Bold" w:hAnsi="Britannic Bold"/>
+          <w:color w:val="232323"/>
+          <w:sz w:val="32"/>
+        </w:rPr>
+        <w:t xml:space="preserve"> </w:t>
+      </w:r>
+      <w:r>
+        <w:rPr>
+          <w:rFonts w:ascii="Britannic Bold" w:hAnsi="Britannic Bold"/>
+          <w:color w:val="232323"/>
+          <w:sz w:val="32"/>
         </w:rPr>
         <w:t>o</w:t>
       </w:r>
       <w:r>
         <w:rPr>
-          <w:rStyle w:val="stego_style"/>
-          <w:color w:val="010000"/>
+          <w:rFonts w:ascii="Britannic Bold" w:hAnsi="Britannic Bold"/>
+          <w:color w:val="232323"/>
+          <w:sz w:val="32"/>
         </w:rPr>
         <w:t>f</w:t>
       </w:r>
       <w:r>
         <w:rPr>
-          <w:rStyle w:val="stego_style"/>
-        </w:rPr>
-        <w:t xml:space="preserve"> </w:t>
-      </w:r>
-      <w:r>
-        <w:rPr>
-          <w:rStyle w:val="stego_style"/>
-          <w:color w:val="030201"/>
+          <w:rFonts w:ascii="Britannic Bold" w:hAnsi="Britannic Bold"/>
+          <w:color w:val="232323"/>
+          <w:sz w:val="32"/>
+        </w:rPr>
+        <w:t xml:space="preserve"> </w:t>
+      </w:r>
+      <w:r>
+        <w:rPr>
+          <w:rFonts w:ascii="Britannic Bold" w:hAnsi="Britannic Bold"/>
+          <w:color w:val="232323"/>
+          <w:sz w:val="32"/>
         </w:rPr>
         <w:t>c</w:t>
       </w:r>
       <w:r>
         <w:rPr>
-          <w:rStyle w:val="stego_style"/>
-          <w:color w:val="030403"/>
+          <w:rFonts w:ascii="Britannic Bold" w:hAnsi="Britannic Bold"/>
+          <w:color w:val="232323"/>
+          <w:sz w:val="32"/>
         </w:rPr>
         <w:t>u</w:t>
       </w:r>
       <w:r>
         <w:rPr>
-          <w:rStyle w:val="stego_style"/>
-          <w:color w:val="030403"/>
+          <w:rFonts w:ascii="Britannic Bold" w:hAnsi="Britannic Bold"/>
+          <w:color w:val="232323"/>
+          <w:sz w:val="32"/>
         </w:rPr>
         <w:t>n</w:t>
       </w:r>
       <w:r>
         <w:rPr>
-          <w:rStyle w:val="stego_style"/>
-          <w:color w:val="030501"/>
+          <w:rFonts w:ascii="Britannic Bold" w:hAnsi="Britannic Bold"/>
+          <w:color w:val="232323"/>
+          <w:sz w:val="32"/>
         </w:rPr>
         <w:t>n</w:t>
       </w:r>
       <w:r>
         <w:rPr>
-          <w:rStyle w:val="stego_style"/>
-          <w:color w:val="030101"/>
+          <w:rFonts w:ascii="Britannic Bold" w:hAnsi="Britannic Bold"/>
+          <w:color w:val="232323"/>
+          <w:sz w:val="32"/>
         </w:rPr>
         <w:t>i</w:t>
       </w:r>
       <w:r>
         <w:rPr>
-          <w:rStyle w:val="stego_style"/>
-          <w:color w:val="010000"/>
+          <w:rFonts w:ascii="Britannic Bold" w:hAnsi="Britannic Bold"/>
+          <w:color w:val="232323"/>
+          <w:sz w:val="32"/>
         </w:rPr>
         <w:t>n</w:t>
       </w:r>
       <w:r>
         <w:rPr>
-          <w:rStyle w:val="stego_style"/>
-          <w:color w:val="030001"/>
+          <w:rFonts w:ascii="Britannic Bold" w:hAnsi="Britannic Bold"/>
+          <w:color w:val="232323"/>
+          <w:sz w:val="32"/>
         </w:rPr>
         <w:t>g</w:t>
       </w:r>
       <w:r>
         <w:rPr>
-          <w:rStyle w:val="stego_style"/>
-        </w:rPr>
-        <w:t xml:space="preserve"> </w:t>
-      </w:r>
-      <w:r>
-        <w:rPr>
-          <w:rStyle w:val="stego_style"/>
-          <w:color w:val="030102"/>
+          <w:rFonts w:ascii="Britannic Bold" w:hAnsi="Britannic Bold"/>
+          <w:color w:val="232323"/>
+          <w:sz w:val="32"/>
+        </w:rPr>
+        <w:t xml:space="preserve"> </w:t>
+      </w:r>
+      <w:r>
+        <w:rPr>
+          <w:rFonts w:ascii="Britannic Bold" w:hAnsi="Britannic Bold"/>
+          <w:color w:val="232323"/>
+          <w:sz w:val="32"/>
         </w:rPr>
         <w:t>b</w:t>
       </w:r>
       <w:r>
         <w:rPr>
-          <w:rStyle w:val="stego_style"/>
-          <w:color w:val="030102"/>
+          <w:rFonts w:ascii="Britannic Bold" w:hAnsi="Britannic Bold"/>
+          <w:color w:val="232323"/>
+          <w:sz w:val="32"/>
         </w:rPr>
         <w:t>e</w:t>
       </w:r>
       <w:r>
         <w:rPr>
-          <w:rStyle w:val="stego_style"/>
-          <w:color w:val="030101"/>
+          <w:rFonts w:ascii="Britannic Bold" w:hAnsi="Britannic Bold"/>
+          <w:color w:val="232323"/>
+          <w:sz w:val="32"/>
         </w:rPr>
         <w:t>c</w:t>
       </w:r>
       <w:r>
         <w:rPr>
-          <w:rStyle w:val="stego_style"/>
-          <w:color w:val="030003"/>
+          <w:rFonts w:ascii="Britannic Bold" w:hAnsi="Britannic Bold"/>
+          <w:color w:val="232323"/>
+          <w:sz w:val="32"/>
         </w:rPr>
         <w:t>o</w:t>
       </w:r>
       <w:r>
         <w:rPr>
-          <w:rStyle w:val="stego_style"/>
-          <w:color w:val="030500"/>
+          <w:rFonts w:ascii="Britannic Bold" w:hAnsi="Britannic Bold"/>
+          <w:color w:val="232323"/>
+          <w:sz w:val="32"/>
         </w:rPr>
         <w:t>m</w:t>
       </w:r>
       <w:r>
         <w:rPr>
-          <w:rStyle w:val="stego_style"/>
-          <w:color w:val="030403"/>
+          <w:rFonts w:ascii="Britannic Bold" w:hAnsi="Britannic Bold"/>
+          <w:color w:val="232323"/>
+          <w:sz w:val="32"/>
         </w:rPr>
         <w:t>e</w:t>
       </w:r>
       <w:r>
         <w:rPr>
-          <w:rStyle w:val="stego_style"/>
-          <w:color w:val="010000"/>
+          <w:rFonts w:ascii="Britannic Bold" w:hAnsi="Britannic Bold"/>
+          <w:color w:val="232323"/>
+          <w:sz w:val="32"/>
         </w:rPr>
         <w:t>s</w:t>
       </w:r>
       <w:r>
         <w:rPr>
-          <w:rStyle w:val="stego_style"/>
-          <w:color w:val="030400"/>
+          <w:rFonts w:ascii="Britannic Bold" w:hAnsi="Britannic Bold"/>
+          <w:color w:val="232323"/>
+          <w:sz w:val="32"/>
         </w:rPr>
         <w:t>.</w:t>
       </w:r>
       <w:r>
         <w:rPr>
-          <w:rStyle w:val="stego_style"/>
-        </w:rPr>
-        <w:t xml:space="preserve"> </w:t>
-      </w:r>
-      <w:r>
-        <w:rPr>
-          <w:rStyle w:val="stego_style"/>
-          <w:color w:val="030402"/>
+          <w:rFonts w:ascii="Britannic Bold" w:hAnsi="Britannic Bold"/>
+          <w:color w:val="232323"/>
+          <w:sz w:val="32"/>
+        </w:rPr>
+        <w:t xml:space="preserve"> </w:t>
+      </w:r>
+      <w:r>
+        <w:rPr>
+          <w:rFonts w:ascii="Britannic Bold" w:hAnsi="Britannic Bold"/>
+          <w:color w:val="232323"/>
+          <w:sz w:val="32"/>
         </w:rPr>
         <w:t>I</w:t>
       </w:r>
       <w:r>
         <w:rPr>
-          <w:rStyle w:val="stego_style"/>
-          <w:color w:val="030101"/>
+          <w:rFonts w:ascii="Britannic Bold" w:hAnsi="Britannic Bold"/>
+          <w:color w:val="232323"/>
+          <w:sz w:val="32"/>
         </w:rPr>
         <w:t>n</w:t>
       </w:r>
       <w:r>
         <w:rPr>
-          <w:rStyle w:val="stego_style"/>
-        </w:rPr>
-        <w:t xml:space="preserve"> </w:t>
-      </w:r>
-      <w:r>
-        <w:rPr>
-          <w:rStyle w:val="stego_style"/>
-          <w:color w:val="030500"/>
+          <w:rFonts w:ascii="Britannic Bold" w:hAnsi="Britannic Bold"/>
+          <w:color w:val="232323"/>
+          <w:sz w:val="32"/>
+        </w:rPr>
+        <w:t xml:space="preserve"> </w:t>
+      </w:r>
+      <w:r>
+        <w:rPr>
+          <w:rFonts w:ascii="Britannic Bold" w:hAnsi="Britannic Bold"/>
+          <w:color w:val="232323"/>
+          <w:sz w:val="32"/>
         </w:rPr>
         <w:t>a</w:t>
       </w:r>
       <w:r>
         <w:rPr>
-          <w:rStyle w:val="stego_style"/>
-        </w:rPr>
-        <w:t xml:space="preserve"> </w:t>
-      </w:r>
-      <w:r>
-        <w:rPr>
-          <w:rStyle w:val="stego_style"/>
-          <w:color w:val="030101"/>
+          <w:rFonts w:ascii="Britannic Bold" w:hAnsi="Britannic Bold"/>
+          <w:color w:val="232323"/>
+          <w:sz w:val="32"/>
+        </w:rPr>
+        <w:t xml:space="preserve"> </w:t>
+      </w:r>
+      <w:r>
+        <w:rPr>
+          <w:rFonts w:ascii="Britannic Bold" w:hAnsi="Britannic Bold"/>
+          <w:color w:val="232323"/>
+          <w:sz w:val="32"/>
         </w:rPr>
         <w:t>s</w:t>
       </w:r>
       <w:r>
         <w:rPr>
-          <w:rStyle w:val="stego_style"/>
-          <w:color w:val="030600"/>
+          <w:rFonts w:ascii="Britannic Bold" w:hAnsi="Britannic Bold"/>
+          <w:color w:val="232323"/>
+          <w:sz w:val="32"/>
         </w:rPr>
         <w:t>t</w:t>
       </w:r>
       <w:r>
         <w:rPr>
-          <w:rStyle w:val="stego_style"/>
-          <w:color w:val="030500"/>
+          <w:rFonts w:ascii="Britannic Bold" w:hAnsi="Britannic Bold"/>
+          <w:color w:val="232323"/>
+          <w:sz w:val="32"/>
         </w:rPr>
         <w:t>a</w:t>
       </w:r>
       <w:r>
         <w:rPr>
-          <w:rStyle w:val="stego_style"/>
-          <w:color w:val="010000"/>
+          <w:rFonts w:ascii="Britannic Bold" w:hAnsi="Britannic Bold"/>
+          <w:color w:val="232323"/>
+          <w:sz w:val="32"/>
         </w:rPr>
         <w:t>t</w:t>
       </w:r>
       <w:r>
         <w:rPr>
-          <w:rStyle w:val="stego_style"/>
-          <w:color w:val="030102"/>
+          <w:rFonts w:ascii="Britannic Bold" w:hAnsi="Britannic Bold"/>
+          <w:color w:val="232323"/>
+          <w:sz w:val="32"/>
         </w:rPr>
         <w:t>e</w:t>
       </w:r>
       <w:r>
         <w:rPr>
-          <w:rStyle w:val="stego_style"/>
-        </w:rPr>
-        <w:t xml:space="preserve"> </w:t>
-      </w:r>
-      <w:r>
-        <w:rPr>
-          <w:rStyle w:val="stego_style"/>
-          <w:color w:val="030303"/>
+          <w:rFonts w:ascii="Britannic Bold" w:hAnsi="Britannic Bold"/>
+          <w:color w:val="232323"/>
+          <w:sz w:val="32"/>
+        </w:rPr>
+        <w:t xml:space="preserve"> </w:t>
+      </w:r>
+      <w:r>
+        <w:rPr>
+          <w:rFonts w:ascii="Britannic Bold" w:hAnsi="Britannic Bold"/>
+          <w:color w:val="232323"/>
+          <w:sz w:val="32"/>
         </w:rPr>
         <w:t>o</w:t>
       </w:r>
       <w:r>
         <w:rPr>
-          <w:rStyle w:val="stego_style"/>
-          <w:color w:val="030402"/>
+          <w:rFonts w:ascii="Britannic Bold" w:hAnsi="Britannic Bold"/>
+          <w:color w:val="232323"/>
+          <w:sz w:val="32"/>
         </w:rPr>
         <w:t>f</w:t>
       </w:r>
       <w:r>
         <w:rPr>
-          <w:rStyle w:val="stego_style"/>
-        </w:rPr>
-        <w:t xml:space="preserve"> </w:t>
-      </w:r>
-      <w:r>
-        <w:rPr>
-          <w:rStyle w:val="stego_style"/>
-          <w:color w:val="010000"/>
+          <w:rFonts w:ascii="Britannic Bold" w:hAnsi="Britannic Bold"/>
+          <w:color w:val="232323"/>
+          <w:sz w:val="32"/>
+        </w:rPr>
+        <w:t xml:space="preserve"> </w:t>
+      </w:r>
+      <w:r>
+        <w:rPr>
+          <w:rFonts w:ascii="Britannic Bold" w:hAnsi="Britannic Bold"/>
+          <w:color w:val="232323"/>
+          <w:sz w:val="32"/>
         </w:rPr>
         <w:t>w</w:t>
       </w:r>
       <w:r>
         <w:rPr>
-          <w:rStyle w:val="stego_style"/>
-          <w:color w:val="030101"/>
+          <w:rFonts w:ascii="Britannic Bold" w:hAnsi="Britannic Bold"/>
+          <w:color w:val="232323"/>
+          <w:sz w:val="32"/>
         </w:rPr>
         <w:t>e</w:t>
       </w:r>
       <w:r>
         <w:rPr>
-          <w:rStyle w:val="stego_style"/>
-          <w:color w:val="030301"/>
+          <w:rFonts w:ascii="Britannic Bold" w:hAnsi="Britannic Bold"/>
+          <w:color w:val="232323"/>
+          <w:sz w:val="32"/>
         </w:rPr>
         <w:t>a</w:t>
       </w:r>
       <w:r>
         <w:rPr>
-          <w:rStyle w:val="stego_style"/>
-          <w:color w:val="030002"/>
+          <w:rFonts w:ascii="Britannic Bold" w:hAnsi="Britannic Bold"/>
+          <w:color w:val="232323"/>
+          <w:sz w:val="32"/>
         </w:rPr>
         <w:t>k</w:t>
       </w:r>
       <w:r>
         <w:rPr>
-          <w:rStyle w:val="stego_style"/>
-          <w:color w:val="030001"/>
+          <w:rFonts w:ascii="Britannic Bold" w:hAnsi="Britannic Bold"/>
+          <w:color w:val="232323"/>
+          <w:sz w:val="32"/>
         </w:rPr>
         <w:t>n</w:t>
       </w:r>
       <w:r>
         <w:rPr>
-          <w:rStyle w:val="stego_style"/>
-          <w:color w:val="030402"/>
+          <w:rFonts w:ascii="Britannic Bold" w:hAnsi="Britannic Bold"/>
+          <w:color w:val="232323"/>
+          <w:sz w:val="32"/>
         </w:rPr>
         <w:t>e</w:t>
       </w:r>
       <w:r>
         <w:rPr>
-          <w:rStyle w:val="stego_style"/>
-          <w:color w:val="030103"/>
+          <w:rFonts w:ascii="Britannic Bold" w:hAnsi="Britannic Bold"/>
+          <w:color w:val="232323"/>
+          <w:sz w:val="32"/>
         </w:rPr>
         <w:t>s</w:t>
       </w:r>
       <w:r>
         <w:rPr>
-          <w:rStyle w:val="stego_style"/>
-          <w:color w:val="030303"/>
+          <w:rFonts w:ascii="Britannic Bold" w:hAnsi="Britannic Bold"/>
+          <w:color w:val="232323"/>
+          <w:sz w:val="32"/>
         </w:rPr>
         <w:t>s</w:t>
       </w:r>
       <w:r>
         <w:rPr>
-          <w:rStyle w:val="stego_style"/>
-        </w:rPr>
-        <w:t xml:space="preserve"> </w:t>
-      </w:r>
-      <w:r>
-        <w:rPr>
-          <w:rStyle w:val="stego_style"/>
-          <w:color w:val="010000"/>
+          <w:rFonts w:ascii="Britannic Bold" w:hAnsi="Britannic Bold"/>
+          <w:color w:val="232323"/>
+          <w:sz w:val="32"/>
+        </w:rPr>
+        <w:t xml:space="preserve"> </w:t>
+      </w:r>
+      <w:r>
+        <w:rPr>
+          <w:rFonts w:ascii="Britannic Bold" w:hAnsi="Britannic Bold"/>
+          <w:color w:val="232323"/>
+          <w:sz w:val="32"/>
         </w:rPr>
         <w:t>a</w:t>
       </w:r>
       <w:r>
         <w:rPr>
-          <w:rStyle w:val="stego_style"/>
-          <w:color w:val="030303"/>
+          <w:rFonts w:ascii="Britannic Bold" w:hAnsi="Britannic Bold"/>
+          <w:color w:val="232323"/>
+          <w:sz w:val="32"/>
         </w:rPr>
         <w:t>n</w:t>
       </w:r>
       <w:r>
         <w:rPr>
-          <w:rStyle w:val="stego_style"/>
-          <w:color w:val="030302"/>
+          <w:rFonts w:ascii="Britannic Bold" w:hAnsi="Britannic Bold"/>
+          <w:color w:val="232323"/>
+          <w:sz w:val="32"/>
         </w:rPr>
         <w:t>d</w:t>
       </w:r>
       <w:r>
         <w:rPr>
-          <w:rStyle w:val="stego_style"/>
-        </w:rPr>
-        <w:t xml:space="preserve"> </w:t>
-      </w:r>
-      <w:r>
-        <w:rPr>
-          <w:rStyle w:val="stego_style"/>
-          <w:color w:val="010000"/>
+          <w:rFonts w:ascii="Britannic Bold" w:hAnsi="Britannic Bold"/>
+          <w:color w:val="232323"/>
+          <w:sz w:val="32"/>
+        </w:rPr>
+        <w:t xml:space="preserve"> </w:t>
+      </w:r>
+      <w:r>
+        <w:rPr>
+          <w:rFonts w:ascii="Britannic Bold" w:hAnsi="Britannic Bold"/>
+          <w:color w:val="232323"/>
+          <w:sz w:val="32"/>
         </w:rPr>
         <w:t>i</w:t>
       </w:r>
       <w:r>
         <w:rPr>
-          <w:rStyle w:val="stego_style"/>
-          <w:color w:val="030002"/>
+          <w:rFonts w:ascii="Britannic Bold" w:hAnsi="Britannic Bold"/>
+          <w:color w:val="232323"/>
+          <w:sz w:val="32"/>
         </w:rPr>
         <w:t>n</w:t>
       </w:r>
       <w:r>
         <w:rPr>
-          <w:rStyle w:val="stego_style"/>
-          <w:color w:val="030601"/>
+          <w:rFonts w:ascii="Britannic Bold" w:hAnsi="Britannic Bold"/>
+          <w:color w:val="232323"/>
+          <w:sz w:val="32"/>
         </w:rPr>
         <w:t>s</w:t>
       </w:r>
       <w:r>
         <w:rPr>
-          <w:rStyle w:val="stego_style"/>
-          <w:color w:val="010301"/>
+          <w:rFonts w:ascii="Britannic Bold" w:hAnsi="Britannic Bold"/>
+          <w:color w:val="232323"/>
+          <w:sz w:val="32"/>
         </w:rPr>
         <w:t>i</w:t>
       </w:r>
       <w:r>
         <w:rPr>
-          <w:rStyle w:val="stego_style"/>
-          <w:color w:val="030400"/>
+          <w:rFonts w:ascii="Britannic Bold" w:hAnsi="Britannic Bold"/>
+          <w:color w:val="232323"/>
+          <w:sz w:val="32"/>
         </w:rPr>
         <w:t>g</w:t>
       </w:r>
       <w:r>
         <w:rPr>
-          <w:rStyle w:val="stego_style"/>
-          <w:color w:val="030402"/>
+          <w:rFonts w:ascii="Britannic Bold" w:hAnsi="Britannic Bold"/>
+          <w:color w:val="232323"/>
+          <w:sz w:val="32"/>
         </w:rPr>
         <w:t>n</w:t>
       </w:r>
       <w:r>
         <w:rPr>
-          <w:rStyle w:val="stego_style"/>
-          <w:color w:val="030303"/>
+          <w:rFonts w:ascii="Britannic Bold" w:hAnsi="Britannic Bold"/>
+          <w:color w:val="232323"/>
+          <w:sz w:val="32"/>
         </w:rPr>
         <w:t>i</w:t>
       </w:r>
       <w:r>
         <w:rPr>
-          <w:rStyle w:val="stego_style"/>
-          <w:color w:val="030100"/>
+          <w:rFonts w:ascii="Britannic Bold" w:hAnsi="Britannic Bold"/>
+          <w:color w:val="232323"/>
+          <w:sz w:val="32"/>
         </w:rPr>
         <w:t>f</w:t>
       </w:r>
       <w:r>
         <w:rPr>
-          <w:rStyle w:val="stego_style"/>
-          <w:color w:val="030501"/>
+          <w:rFonts w:ascii="Britannic Bold" w:hAnsi="Britannic Bold"/>
+          <w:color w:val="232323"/>
+          <w:sz w:val="32"/>
         </w:rPr>
         <w:t>i</w:t>
       </w:r>
       <w:r>
         <w:rPr>
-          <w:rStyle w:val="stego_style"/>
-          <w:color w:val="030003"/>
+          <w:rFonts w:ascii="Britannic Bold" w:hAnsi="Britannic Bold"/>
+          <w:color w:val="232323"/>
+          <w:sz w:val="32"/>
         </w:rPr>
         <w:t>c</w:t>
       </w:r>
       <w:r>
         <w:rPr>
-          <w:rStyle w:val="stego_style"/>
-          <w:color w:val="030500"/>
+          <w:rFonts w:ascii="Britannic Bold" w:hAnsi="Britannic Bold"/>
+          <w:color w:val="232323"/>
+          <w:sz w:val="32"/>
         </w:rPr>
         <w:t>a</w:t>
       </w:r>
       <w:r>
         <w:rPr>
-          <w:rStyle w:val="stego_style"/>
-          <w:color w:val="030403"/>
+          <w:rFonts w:ascii="Britannic Bold" w:hAnsi="Britannic Bold"/>
+          <w:color w:val="232323"/>
+          <w:sz w:val="32"/>
         </w:rPr>
         <w:t>n</w:t>
       </w:r>
       <w:r>
         <w:rPr>
-          <w:rStyle w:val="stego_style"/>
-          <w:color w:val="010300"/>
+          <w:rFonts w:ascii="Britannic Bold" w:hAnsi="Britannic Bold"/>
+          <w:color w:val="232323"/>
+          <w:sz w:val="32"/>
         </w:rPr>
         <w:t>c</w:t>
       </w:r>
       <w:r>
         <w:rPr>
-          <w:rStyle w:val="stego_style"/>
-          <w:color w:val="010000"/>
+          <w:rFonts w:ascii="Britannic Bold" w:hAnsi="Britannic Bold"/>
+          <w:color w:val="232323"/>
+          <w:sz w:val="32"/>
         </w:rPr>
         <w:t>e</w:t>
       </w:r>
       <w:r>
         <w:rPr>
-          <w:rStyle w:val="stego_style"/>
-          <w:color w:val="030101"/>
+          <w:rFonts w:ascii="Britannic Bold" w:hAnsi="Britannic Bold"/>
+          <w:color w:val="232323"/>
+          <w:sz w:val="32"/>
         </w:rPr>
         <w:t>,</w:t>
       </w:r>
       <w:r>
         <w:rPr>
-          <w:rStyle w:val="stego_style"/>
-        </w:rPr>
-        <w:t xml:space="preserve"> </w:t>
-      </w:r>
-      <w:r>
-        <w:rPr>
-          <w:rStyle w:val="stego_style"/>
-          <w:color w:val="030202"/>
+          <w:rFonts w:ascii="Britannic Bold" w:hAnsi="Britannic Bold"/>
+          <w:color w:val="232323"/>
+          <w:sz w:val="32"/>
+        </w:rPr>
+        <w:t xml:space="preserve"> </w:t>
+      </w:r>
+      <w:r>
+        <w:rPr>
+          <w:rFonts w:ascii="Britannic Bold" w:hAnsi="Britannic Bold"/>
+          <w:color w:val="232323"/>
+          <w:sz w:val="32"/>
         </w:rPr>
         <w:t>w</w:t>
       </w:r>
       <w:r>
         <w:rPr>
-          <w:rStyle w:val="stego_style"/>
-          <w:color w:val="030101"/>
+          <w:rFonts w:ascii="Britannic Bold" w:hAnsi="Britannic Bold"/>
+          <w:color w:val="232323"/>
+          <w:sz w:val="32"/>
         </w:rPr>
         <w:t>h</w:t>
       </w:r>
       <w:r>
         <w:rPr>
-          <w:rStyle w:val="stego_style"/>
-          <w:color w:val="030003"/>
+          <w:rFonts w:ascii="Britannic Bold" w:hAnsi="Britannic Bold"/>
+          <w:color w:val="232323"/>
+          <w:sz w:val="32"/>
         </w:rPr>
         <w:t>e</w:t>
       </w:r>
       <w:r>
         <w:rPr>
-          <w:rStyle w:val="stego_style"/>
-          <w:color w:val="030500"/>
+          <w:rFonts w:ascii="Britannic Bold" w:hAnsi="Britannic Bold"/>
+          <w:color w:val="232323"/>
+          <w:sz w:val="32"/>
         </w:rPr>
         <w:t>n</w:t>
       </w:r>
       <w:r>
         <w:rPr>
-          <w:rStyle w:val="stego_style"/>
-        </w:rPr>
-        <w:t xml:space="preserve"> </w:t>
-      </w:r>
-      <w:r>
-        <w:rPr>
-          <w:rStyle w:val="stego_style"/>
-          <w:color w:val="030201"/>
+          <w:rFonts w:ascii="Britannic Bold" w:hAnsi="Britannic Bold"/>
+          <w:color w:val="232323"/>
+          <w:sz w:val="32"/>
+        </w:rPr>
+        <w:t xml:space="preserve"> </w:t>
+      </w:r>
+      <w:r>
+        <w:rPr>
+          <w:rFonts w:ascii="Britannic Bold" w:hAnsi="Britannic Bold"/>
+          <w:color w:val="232323"/>
+          <w:sz w:val="32"/>
         </w:rPr>
         <w:t>p</w:t>
       </w:r>
       <w:r>
         <w:rPr>
-          <w:rStyle w:val="stego_style"/>
-          <w:color w:val="030302"/>
+          <w:rFonts w:ascii="Britannic Bold" w:hAnsi="Britannic Bold"/>
+          <w:color w:val="232323"/>
+          <w:sz w:val="32"/>
         </w:rPr>
         <w:t>r</w:t>
       </w:r>
       <w:r>
         <w:rPr>
-          <w:rStyle w:val="stego_style"/>
-          <w:color w:val="030103"/>
+          <w:rFonts w:ascii="Britannic Bold" w:hAnsi="Britannic Bold"/>
+          <w:color w:val="232323"/>
+          <w:sz w:val="32"/>
         </w:rPr>
         <w:t>u</w:t>
       </w:r>
       <w:r>
         <w:rPr>
-          <w:rStyle w:val="stego_style"/>
-          <w:color w:val="010000"/>
+          <w:rFonts w:ascii="Britannic Bold" w:hAnsi="Britannic Bold"/>
+          <w:color w:val="232323"/>
+          <w:sz w:val="32"/>
         </w:rPr>
         <w:t>d</w:t>
       </w:r>
       <w:r>
         <w:rPr>
-          <w:rStyle w:val="stego_style"/>
-          <w:color w:val="030403"/>
+          <w:rFonts w:ascii="Britannic Bold" w:hAnsi="Britannic Bold"/>
+          <w:color w:val="232323"/>
+          <w:sz w:val="32"/>
         </w:rPr>
         <w:t>e</w:t>
       </w:r>
       <w:r>
         <w:rPr>
-          <w:rStyle w:val="stego_style"/>
-          <w:color w:val="030501"/>
+          <w:rFonts w:ascii="Britannic Bold" w:hAnsi="Britannic Bold"/>
+          <w:color w:val="232323"/>
+          <w:sz w:val="32"/>
         </w:rPr>
         <w:t>n</w:t>
       </w:r>
       <w:r>
         <w:rPr>
-          <w:rStyle w:val="stego_style"/>
-          <w:color w:val="030101"/>
+          <w:rFonts w:ascii="Britannic Bold" w:hAnsi="Britannic Bold"/>
+          <w:color w:val="232323"/>
+          <w:sz w:val="32"/>
         </w:rPr>
         <w:t>c</w:t>
       </w:r>
       <w:r>
         <w:rPr>
-          <w:rStyle w:val="stego_style"/>
-          <w:color w:val="030500"/>
+          <w:rFonts w:ascii="Britannic Bold" w:hAnsi="Britannic Bold"/>
+          <w:color w:val="232323"/>
+          <w:sz w:val="32"/>
         </w:rPr>
         <w:t>e</w:t>
       </w:r>
       <w:r>
         <w:rPr>
-          <w:rStyle w:val="stego_style"/>
-          <w:color w:val="030403"/>
+          <w:rFonts w:ascii="Britannic Bold" w:hAnsi="Britannic Bold"/>
+          <w:color w:val="232323"/>
+          <w:sz w:val="32"/>
         </w:rPr>
         <w:t>,</w:t>
       </w:r>
       <w:r>
         <w:rPr>
-          <w:rStyle w:val="stego_style"/>
-        </w:rPr>
-        <w:t xml:space="preserve"> </w:t>
-      </w:r>
-      <w:r>
-        <w:rPr>
-          <w:rStyle w:val="stego_style"/>
-          <w:color w:val="010000"/>
+          <w:rFonts w:ascii="Britannic Bold" w:hAnsi="Britannic Bold"/>
+          <w:color w:val="232323"/>
+          <w:sz w:val="32"/>
+        </w:rPr>
+        <w:t xml:space="preserve"> </w:t>
+      </w:r>
+      <w:r>
+        <w:rPr>
+          <w:rFonts w:ascii="Britannic Bold" w:hAnsi="Britannic Bold"/>
+          <w:color w:val="232323"/>
+          <w:sz w:val="32"/>
         </w:rPr>
         <w:t>j</w:t>
       </w:r>
       <w:r>
         <w:rPr>
-          <w:rStyle w:val="stego_style"/>
-          <w:color w:val="030001"/>
+          <w:rFonts w:ascii="Britannic Bold" w:hAnsi="Britannic Bold"/>
+          <w:color w:val="232323"/>
+          <w:sz w:val="32"/>
         </w:rPr>
         <w:t>u</w:t>
       </w:r>
       <w:r>
         <w:rPr>
-          <w:rStyle w:val="stego_style"/>
-          <w:color w:val="030302"/>
+          <w:rFonts w:ascii="Britannic Bold" w:hAnsi="Britannic Bold"/>
+          <w:color w:val="232323"/>
+          <w:sz w:val="32"/>
         </w:rPr>
         <w:t>d</w:t>
       </w:r>
       <w:r>
         <w:rPr>
-          <w:rStyle w:val="stego_style"/>
-          <w:color w:val="030100"/>
+          <w:rFonts w:ascii="Britannic Bold" w:hAnsi="Britannic Bold"/>
+          <w:color w:val="232323"/>
+          <w:sz w:val="32"/>
         </w:rPr>
         <w:t>g</w:t>
       </w:r>
       <w:r>
         <w:rPr>
-          <w:rStyle w:val="stego_style"/>
-          <w:color w:val="010000"/>
+          <w:rFonts w:ascii="Britannic Bold" w:hAnsi="Britannic Bold"/>
+          <w:color w:val="232323"/>
+          <w:sz w:val="32"/>
         </w:rPr>
         <w:t>m</w:t>
       </w:r>
       <w:r>
         <w:rPr>
-          <w:rStyle w:val="stego_style"/>
-          <w:color w:val="030502"/>
+          <w:rFonts w:ascii="Britannic Bold" w:hAnsi="Britannic Bold"/>
+          <w:color w:val="232323"/>
+          <w:sz w:val="32"/>
         </w:rPr>
         <w:t>e</w:t>
       </w:r>
       <w:r>
         <w:rPr>
-          <w:rStyle w:val="stego_style"/>
-          <w:color w:val="030101"/>
+          <w:rFonts w:ascii="Britannic Bold" w:hAnsi="Britannic Bold"/>
+          <w:color w:val="232323"/>
+          <w:sz w:val="32"/>
         </w:rPr>
         <w:t>n</w:t>
       </w:r>
       <w:r>
         <w:rPr>
-          <w:rStyle w:val="stego_style"/>
-          <w:color w:val="030103"/>
+          <w:rFonts w:ascii="Britannic Bold" w:hAnsi="Britannic Bold"/>
+          <w:color w:val="232323"/>
+          <w:sz w:val="32"/>
         </w:rPr>
         <w:t>t</w:t>
       </w:r>
       <w:r>
         <w:rPr>
-          <w:rStyle w:val="stego_style"/>
-          <w:color w:val="030101"/>
+          <w:rFonts w:ascii="Britannic Bold" w:hAnsi="Britannic Bold"/>
+          <w:color w:val="232323"/>
+          <w:sz w:val="32"/>
         </w:rPr>
         <w:t>,</w:t>
       </w:r>
       <w:r>
         <w:rPr>
-          <w:rStyle w:val="stego_style"/>
-        </w:rPr>
-        <w:t xml:space="preserve"> </w:t>
-      </w:r>
-      <w:r>
-        <w:rPr>
-          <w:rStyle w:val="stego_style"/>
-          <w:color w:val="030500"/>
+          <w:rFonts w:ascii="Britannic Bold" w:hAnsi="Britannic Bold"/>
+          <w:color w:val="232323"/>
+          <w:sz w:val="32"/>
+        </w:rPr>
+        <w:t xml:space="preserve"> </w:t>
+      </w:r>
+      <w:r>
+        <w:rPr>
+          <w:rFonts w:ascii="Britannic Bold" w:hAnsi="Britannic Bold"/>
+          <w:color w:val="232323"/>
+          <w:sz w:val="32"/>
         </w:rPr>
         <w:t>a</w:t>
       </w:r>
       <w:r>
         <w:rPr>
-          <w:rStyle w:val="stego_style"/>
-          <w:color w:val="030001"/>
+          <w:rFonts w:ascii="Britannic Bold" w:hAnsi="Britannic Bold"/>
+          <w:color w:val="232323"/>
+          <w:sz w:val="32"/>
         </w:rPr>
         <w:t>n</w:t>
       </w:r>
       <w:r>
         <w:rPr>
-          <w:rStyle w:val="stego_style"/>
-          <w:color w:val="030002"/>
+          <w:rFonts w:ascii="Britannic Bold" w:hAnsi="Britannic Bold"/>
+          <w:color w:val="232323"/>
+          <w:sz w:val="32"/>
         </w:rPr>
         <w:t>d</w:t>
       </w:r>
       <w:r>
         <w:rPr>
-          <w:rStyle w:val="stego_style"/>
-        </w:rPr>
-        <w:t xml:space="preserve"> </w:t>
-      </w:r>
-      <w:r>
-        <w:rPr>
-          <w:rStyle w:val="stego_style"/>
-          <w:color w:val="030300"/>
+          <w:rFonts w:ascii="Britannic Bold" w:hAnsi="Britannic Bold"/>
+          <w:color w:val="232323"/>
+          <w:sz w:val="32"/>
+        </w:rPr>
+        <w:t xml:space="preserve"> </w:t>
+      </w:r>
+      <w:r>
+        <w:rPr>
+          <w:rFonts w:ascii="Britannic Bold" w:hAnsi="Britannic Bold"/>
+          <w:color w:val="232323"/>
+          <w:sz w:val="32"/>
         </w:rPr>
         <w:t>a</w:t>
       </w:r>
       <w:r>
         <w:rPr>
-          <w:rStyle w:val="stego_style"/>
-          <w:color w:val="030101"/>
+          <w:rFonts w:ascii="Britannic Bold" w:hAnsi="Britannic Bold"/>
+          <w:color w:val="232323"/>
+          <w:sz w:val="32"/>
         </w:rPr>
         <w:t>b</w:t>
       </w:r>
       <w:r>
         <w:rPr>
-          <w:rStyle w:val="stego_style"/>
-          <w:color w:val="010000"/>
+          <w:rFonts w:ascii="Britannic Bold" w:hAnsi="Britannic Bold"/>
+          <w:color w:val="232323"/>
+          <w:sz w:val="32"/>
         </w:rPr>
         <w:t>i</w:t>
       </w:r>
       <w:r>
         <w:rPr>
-          <w:rStyle w:val="stego_style"/>
-          <w:color w:val="030303"/>
+          <w:rFonts w:ascii="Britannic Bold" w:hAnsi="Britannic Bold"/>
+          <w:color w:val="232323"/>
+          <w:sz w:val="32"/>
         </w:rPr>
         <w:t>l</w:t>
       </w:r>
       <w:r>
         <w:rPr>
-          <w:rStyle w:val="stego_style"/>
-          <w:color w:val="030201"/>
+          <w:rFonts w:ascii="Britannic Bold" w:hAnsi="Britannic Bold"/>
+          <w:color w:val="232323"/>
+          <w:sz w:val="32"/>
         </w:rPr>
         <w:t>i</w:t>
       </w:r>
       <w:r>
         <w:rPr>
-          <w:rStyle w:val="stego_style"/>
-          <w:color w:val="030300"/>
+          <w:rFonts w:ascii="Britannic Bold" w:hAnsi="Britannic Bold"/>
+          <w:color w:val="232323"/>
+          <w:sz w:val="32"/>
         </w:rPr>
         <w:t>t</w:t>
       </w:r>
       <w:r>
         <w:rPr>
-          <w:rStyle w:val="stego_style"/>
-          <w:color w:val="030403"/>
+          <w:rFonts w:ascii="Britannic Bold" w:hAnsi="Britannic Bold"/>
+          <w:color w:val="232323"/>
+          <w:sz w:val="32"/>
         </w:rPr>
         <w:t>y</w:t>
       </w:r>
       <w:r>
         <w:rPr>
-          <w:rStyle w:val="stego_style"/>
-        </w:rPr>
-        <w:t xml:space="preserve"> </w:t>
-      </w:r>
-      <w:r>
-        <w:rPr>
-          <w:rStyle w:val="stego_style"/>
-          <w:color w:val="010302"/>
+          <w:rFonts w:ascii="Britannic Bold" w:hAnsi="Britannic Bold"/>
+          <w:color w:val="232323"/>
+          <w:sz w:val="32"/>
+        </w:rPr>
+        <w:t xml:space="preserve"> </w:t>
+      </w:r>
+      <w:r>
+        <w:rPr>
+          <w:rFonts w:ascii="Britannic Bold" w:hAnsi="Britannic Bold"/>
+          <w:color w:val="232323"/>
+          <w:sz w:val="32"/>
         </w:rPr>
         <w:t>n</w:t>
       </w:r>
       <w:r>
         <w:rPr>
-          <w:rStyle w:val="stego_style"/>
+          <w:rFonts w:ascii="Britannic Bold" w:hAnsi="Britannic Bold"/>
+          <w:color w:val="232323"/>
+          <w:sz w:val="32"/>
         </w:rPr>
         <w:t>o longer suffice, cunning may well appear the only hope. The bleaker the situation, with everything concentrating on a single desperate attempt, the more readily cunning is joined to daring. Released from all future considerations, and liberated from thoughts of later retribution, boldness and cunning will be free to augment each other to the point of concentrating a faint glimmer of hope into a single beam of light which may yet kindle a flame.</w:t>
       </w:r>
@@ -2613,14 +2917,6 @@
       <w:spacing w:val="5"/>
     </w:rPr>
   </w:style>
-  <w:style w:type="character" w:customStyle="1" w:styleId="stego_style">
-    <w:name w:val="stego_style"/>
-    <w:rPr>
-      <w:rFonts w:ascii="Britannic Bold" w:hAnsi="Britannic Bold"/>
-      <w:color w:val="232323"/>
-      <w:sz w:val="32"/>
-    </w:rPr>
-  </w:style>
 </w:styles>
 </file>
 

</xml_diff>